<commit_message>
fix typo in spatial-sql-explorer cover image
</commit_message>
<xml_diff>
--- a/docs/posts/spatial-sql-exporer/index.docx
+++ b/docs/posts/spatial-sql-exporer/index.docx
@@ -3297,24 +3297,6 @@
       </w:r>
       <w:r>
         <w:t xml:space="preserve">to correctly reconstruct state from a shared link. This name is hardcoded in several places. A better design would treat the demo like any other loaded file and infer the table name dynamically.</w:t>
-      </w:r>
-    </w:p>
-    <w:p>
-      <w:pPr>
-        <w:pStyle w:val="BodyText"/>
-      </w:pPr>
-      <w:r>
-        <w:rPr>
-          <w:b/>
-          <w:bCs/>
-        </w:rPr>
-        <w:t xml:space="preserve">PNG export on satellite/topo basemaps.</w:t>
-      </w:r>
-      <w:r>
-        <w:t xml:space="preserve"> </w:t>
-      </w:r>
-      <w:r>
-        <w:t xml:space="preserve">CORS restrictions on the Esri and OpenTopoMap tile servers taint the canvas, making full map export impossible without a server-side rendering step. Not a blocker, but worth knowing up front.</w:t>
       </w:r>
     </w:p>
     <w:bookmarkEnd w:id="32"/>

</xml_diff>